<commit_message>
Update report: plain text/tables, remove driver issue, add code structure
</commit_message>
<xml_diff>
--- a/A1实验报告.docx
+++ b/A1实验报告.docx
@@ -2,13 +2,13 @@
 <file path=word/document.xml><?xml version="1.0" encoding="utf-8"?>
 <w:document xmlns:w="http://schemas.openxmlformats.org/wordprocessingml/2006/main" xmlns:m="http://schemas.openxmlformats.org/officeDocument/2006/math" xmlns:r="http://schemas.openxmlformats.org/officeDocument/2006/relationships" xmlns:o="urn:schemas-microsoft-com:office:office" xmlns:v="urn:schemas-microsoft-com:vml" xmlns:w10="urn:schemas-microsoft-com:office:word" xmlns:a="http://schemas.openxmlformats.org/drawingml/2006/main" xmlns:pic="http://schemas.openxmlformats.org/drawingml/2006/picture" xmlns:wp="http://schemas.openxmlformats.org/drawingml/2006/wordprocessingDrawing">
   <w:body>
-    <w:bookmarkStart w:id="32" w:name="aist4010-a1-人脸分类-完整实验报告"/>
+    <w:bookmarkStart w:id="31" w:name="aist4010-a1-人脸分类-实验报告"/>
     <w:p>
       <w:pPr>
         <w:pStyle w:val="Heading1"/>
       </w:pPr>
       <w:r>
-        <w:t xml:space="preserve">AIST4010 A1 人脸分类 · 完整实验报告</w:t>
+        <w:t xml:space="preserve">AIST4010 A1 人脸分类 · 实验报告</w:t>
       </w:r>
     </w:p>
     <w:p>
@@ -66,13 +66,609 @@
         </w:pict>
       </w:r>
     </w:p>
-    <w:bookmarkStart w:id="20" w:name="一最终方案"/>
+    <w:bookmarkStart w:id="20" w:name="一代码结构"/>
     <w:p>
       <w:pPr>
         <w:pStyle w:val="Heading2"/>
       </w:pPr>
       <w:r>
-        <w:t xml:space="preserve">一、最终方案</w:t>
+        <w:t xml:space="preserve">一、代码结构</w:t>
+      </w:r>
+    </w:p>
+    <w:p>
+      <w:pPr>
+        <w:pStyle w:val="FirstParagraph"/>
+      </w:pPr>
+      <w:r>
+        <w:t xml:space="preserve">代码共 8 个脚本,分为训练脚本、软标签工具与集成脚本三类。整体为”两教师 → 软标签 → 蒸馏学生 → 多样性成员 → 集成”的管线。</w:t>
+      </w:r>
+    </w:p>
+    <w:tbl>
+      <w:tblPr>
+        <w:tblStyle w:val="Table"/>
+        <w:tblW w:type="pct" w:w="5000"/>
+        <w:tblLook w:firstRow="1" w:lastRow="0" w:firstColumn="0" w:lastColumn="0" w:noHBand="0" w:noVBand="0" w:val="0020"/>
+        <w:jc w:val="start"/>
+      </w:tblPr>
+      <w:tblGrid>
+        <w:gridCol w:w="2640"/>
+        <w:gridCol w:w="2640"/>
+        <w:gridCol w:w="2640"/>
+      </w:tblGrid>
+      <w:tr>
+        <w:trPr>
+          <w:tblHeader w:val="true"/>
+        </w:trPr>
+        <w:tc>
+          <w:tcPr/>
+          <w:p>
+            <w:pPr>
+              <w:pStyle w:val="Compact"/>
+              <w:jc w:val="left"/>
+            </w:pPr>
+            <w:r>
+              <w:t xml:space="preserve">文件</w:t>
+            </w:r>
+          </w:p>
+        </w:tc>
+        <w:tc>
+          <w:tcPr/>
+          <w:p>
+            <w:pPr>
+              <w:pStyle w:val="Compact"/>
+              <w:jc w:val="left"/>
+            </w:pPr>
+            <w:r>
+              <w:t xml:space="preserve">作用</w:t>
+            </w:r>
+          </w:p>
+        </w:tc>
+        <w:tc>
+          <w:tcPr/>
+          <w:p>
+            <w:pPr>
+              <w:pStyle w:val="Compact"/>
+              <w:jc w:val="left"/>
+            </w:pPr>
+            <w:r>
+              <w:t xml:space="preserve">产物</w:t>
+            </w:r>
+          </w:p>
+        </w:tc>
+      </w:tr>
+      <w:tr>
+        <w:tc>
+          <w:tcPr/>
+          <w:p>
+            <w:pPr>
+              <w:pStyle w:val="Compact"/>
+              <w:jc w:val="left"/>
+            </w:pPr>
+            <w:r>
+              <w:rPr>
+                <w:rStyle w:val="VerbatimChar"/>
+              </w:rPr>
+              <w:t xml:space="preserve">train/train_resnet.py</w:t>
+            </w:r>
+          </w:p>
+        </w:tc>
+        <w:tc>
+          <w:tcPr/>
+          <w:p>
+            <w:pPr>
+              <w:pStyle w:val="Compact"/>
+              <w:jc w:val="left"/>
+            </w:pPr>
+            <w:r>
+              <w:t xml:space="preserve">基线 ResNet 训练(教师 1, 清晰版)</w:t>
+            </w:r>
+          </w:p>
+        </w:tc>
+        <w:tc>
+          <w:tcPr/>
+          <w:p>
+            <w:pPr>
+              <w:pStyle w:val="Compact"/>
+              <w:jc w:val="left"/>
+            </w:pPr>
+            <w:r>
+              <w:rPr>
+                <w:rStyle w:val="VerbatimChar"/>
+              </w:rPr>
+              <w:t xml:space="preserve">best.pth</w:t>
+            </w:r>
+            <w:r>
+              <w:t xml:space="preserve"> </w:t>
+            </w:r>
+            <w:r>
+              <w:t xml:space="preserve">(val 77.8%)</w:t>
+            </w:r>
+          </w:p>
+        </w:tc>
+      </w:tr>
+      <w:tr>
+        <w:tc>
+          <w:tcPr/>
+          <w:p>
+            <w:pPr>
+              <w:pStyle w:val="Compact"/>
+              <w:jc w:val="left"/>
+            </w:pPr>
+            <w:r>
+              <w:rPr>
+                <w:rStyle w:val="VerbatimChar"/>
+              </w:rPr>
+              <w:t xml:space="preserve">train/train_blur.py</w:t>
+            </w:r>
+          </w:p>
+        </w:tc>
+        <w:tc>
+          <w:tcPr/>
+          <w:p>
+            <w:pPr>
+              <w:pStyle w:val="Compact"/>
+              <w:jc w:val="left"/>
+            </w:pPr>
+            <w:r>
+              <w:t xml:space="preserve">模糊增强 + 标签平滑训练(教师 2, 模糊鲁棒)</w:t>
+            </w:r>
+          </w:p>
+        </w:tc>
+        <w:tc>
+          <w:tcPr/>
+          <w:p>
+            <w:pPr>
+              <w:pStyle w:val="Compact"/>
+              <w:jc w:val="left"/>
+            </w:pPr>
+            <w:r>
+              <w:rPr>
+                <w:rStyle w:val="VerbatimChar"/>
+              </w:rPr>
+              <w:t xml:space="preserve">best_blur.pth</w:t>
+            </w:r>
+            <w:r>
+              <w:t xml:space="preserve"> </w:t>
+            </w:r>
+            <w:r>
+              <w:t xml:space="preserve">(val 77.0%)</w:t>
+            </w:r>
+          </w:p>
+        </w:tc>
+      </w:tr>
+      <w:tr>
+        <w:tc>
+          <w:tcPr/>
+          <w:p>
+            <w:pPr>
+              <w:pStyle w:val="Compact"/>
+              <w:jc w:val="left"/>
+            </w:pPr>
+            <w:r>
+              <w:rPr>
+                <w:rStyle w:val="VerbatimChar"/>
+              </w:rPr>
+              <w:t xml:space="preserve">utility/generate_teacher_logits.py</w:t>
+            </w:r>
+          </w:p>
+        </w:tc>
+        <w:tc>
+          <w:tcPr/>
+          <w:p>
+            <w:pPr>
+              <w:pStyle w:val="Compact"/>
+              <w:jc w:val="left"/>
+            </w:pPr>
+            <w:r>
+              <w:t xml:space="preserve">教师集成在 train 集上生成软标签</w:t>
+            </w:r>
+          </w:p>
+        </w:tc>
+        <w:tc>
+          <w:tcPr/>
+          <w:p>
+            <w:pPr>
+              <w:pStyle w:val="Compact"/>
+              <w:jc w:val="left"/>
+            </w:pPr>
+            <w:r>
+              <w:rPr>
+                <w:rStyle w:val="VerbatimChar"/>
+              </w:rPr>
+              <w:t xml:space="preserve">teacher_logits_fp16.pt</w:t>
+            </w:r>
+          </w:p>
+        </w:tc>
+      </w:tr>
+      <w:tr>
+        <w:tc>
+          <w:tcPr/>
+          <w:p>
+            <w:pPr>
+              <w:pStyle w:val="Compact"/>
+              <w:jc w:val="left"/>
+            </w:pPr>
+            <w:r>
+              <w:rPr>
+                <w:rStyle w:val="VerbatimChar"/>
+              </w:rPr>
+              <w:t xml:space="preserve">train/train_student.py</w:t>
+            </w:r>
+          </w:p>
+        </w:tc>
+        <w:tc>
+          <w:tcPr/>
+          <w:p>
+            <w:pPr>
+              <w:pStyle w:val="Compact"/>
+              <w:jc w:val="left"/>
+            </w:pPr>
+            <w:r>
+              <w:t xml:space="preserve">一阶段自蒸馏, 加宽学生网络, 64px</w:t>
+            </w:r>
+          </w:p>
+        </w:tc>
+        <w:tc>
+          <w:tcPr/>
+          <w:p>
+            <w:pPr>
+              <w:pStyle w:val="Compact"/>
+              <w:jc w:val="left"/>
+            </w:pPr>
+            <w:r>
+              <w:rPr>
+                <w:rStyle w:val="VerbatimChar"/>
+              </w:rPr>
+              <w:t xml:space="preserve">best_student.pth</w:t>
+            </w:r>
+            <w:r>
+              <w:t xml:space="preserve"> </w:t>
+            </w:r>
+            <w:r>
+              <w:t xml:space="preserve">(dist64, val 83.5%)</w:t>
+            </w:r>
+          </w:p>
+        </w:tc>
+      </w:tr>
+      <w:tr>
+        <w:tc>
+          <w:tcPr/>
+          <w:p>
+            <w:pPr>
+              <w:pStyle w:val="Compact"/>
+              <w:jc w:val="left"/>
+            </w:pPr>
+            <w:r>
+              <w:rPr>
+                <w:rStyle w:val="VerbatimChar"/>
+              </w:rPr>
+              <w:t xml:space="preserve">train/train_final.py</w:t>
+            </w:r>
+          </w:p>
+        </w:tc>
+        <w:tc>
+          <w:tcPr/>
+          <w:p>
+            <w:pPr>
+              <w:pStyle w:val="Compact"/>
+              <w:jc w:val="left"/>
+            </w:pPr>
+            <w:r>
+              <w:t xml:space="preserve">二阶段自蒸馏, 128px + 梯度累积</w:t>
+            </w:r>
+          </w:p>
+        </w:tc>
+        <w:tc>
+          <w:tcPr/>
+          <w:p>
+            <w:pPr>
+              <w:pStyle w:val="Compact"/>
+              <w:jc w:val="left"/>
+            </w:pPr>
+            <w:r>
+              <w:rPr>
+                <w:rStyle w:val="VerbatimChar"/>
+              </w:rPr>
+              <w:t xml:space="preserve">best_final.pth</w:t>
+            </w:r>
+            <w:r>
+              <w:t xml:space="preserve"> </w:t>
+            </w:r>
+            <w:r>
+              <w:t xml:space="preserve">(dist128, val 83.9%)</w:t>
+            </w:r>
+          </w:p>
+        </w:tc>
+      </w:tr>
+      <w:tr>
+        <w:tc>
+          <w:tcPr/>
+          <w:p>
+            <w:pPr>
+              <w:pStyle w:val="Compact"/>
+              <w:jc w:val="left"/>
+            </w:pPr>
+            <w:r>
+              <w:rPr>
+                <w:rStyle w:val="VerbatimChar"/>
+              </w:rPr>
+              <w:t xml:space="preserve">train/train_adam.py</w:t>
+            </w:r>
+          </w:p>
+        </w:tc>
+        <w:tc>
+          <w:tcPr/>
+          <w:p>
+            <w:pPr>
+              <w:pStyle w:val="Compact"/>
+              <w:jc w:val="left"/>
+            </w:pPr>
+            <w:r>
+              <w:t xml:space="preserve">AdamW 优化器版, 提供优化器多样性</w:t>
+            </w:r>
+          </w:p>
+        </w:tc>
+        <w:tc>
+          <w:tcPr/>
+          <w:p>
+            <w:pPr>
+              <w:pStyle w:val="Compact"/>
+              <w:jc w:val="left"/>
+            </w:pPr>
+            <w:r>
+              <w:rPr>
+                <w:rStyle w:val="VerbatimChar"/>
+              </w:rPr>
+              <w:t xml:space="preserve">best_adam.pth</w:t>
+            </w:r>
+            <w:r>
+              <w:t xml:space="preserve"> </w:t>
+            </w:r>
+            <w:r>
+              <w:t xml:space="preserve">(val 82.0%)</w:t>
+            </w:r>
+          </w:p>
+        </w:tc>
+      </w:tr>
+      <w:tr>
+        <w:tc>
+          <w:tcPr/>
+          <w:p>
+            <w:pPr>
+              <w:pStyle w:val="Compact"/>
+              <w:jc w:val="left"/>
+            </w:pPr>
+            <w:r>
+              <w:rPr>
+                <w:rStyle w:val="VerbatimChar"/>
+              </w:rPr>
+              <w:t xml:space="preserve">train/train_mutual.py</w:t>
+            </w:r>
+          </w:p>
+        </w:tc>
+        <w:tc>
+          <w:tcPr/>
+          <w:p>
+            <w:pPr>
+              <w:pStyle w:val="Compact"/>
+              <w:jc w:val="left"/>
+            </w:pPr>
+            <w:r>
+              <w:t xml:space="preserve">相互蒸馏(SGD + Adam 软标签混合)</w:t>
+            </w:r>
+          </w:p>
+        </w:tc>
+        <w:tc>
+          <w:tcPr/>
+          <w:p>
+            <w:pPr>
+              <w:pStyle w:val="Compact"/>
+              <w:jc w:val="left"/>
+            </w:pPr>
+            <w:r>
+              <w:rPr>
+                <w:rStyle w:val="VerbatimChar"/>
+              </w:rPr>
+              <w:t xml:space="preserve">best_mutual.pth</w:t>
+            </w:r>
+            <w:r>
+              <w:t xml:space="preserve"> </w:t>
+            </w:r>
+            <w:r>
+              <w:t xml:space="preserve">(val 82.65%)</w:t>
+            </w:r>
+          </w:p>
+        </w:tc>
+      </w:tr>
+      <w:tr>
+        <w:tc>
+          <w:tcPr/>
+          <w:p>
+            <w:pPr>
+              <w:pStyle w:val="Compact"/>
+              <w:jc w:val="left"/>
+            </w:pPr>
+            <w:r>
+              <w:rPr>
+                <w:rStyle w:val="VerbatimChar"/>
+              </w:rPr>
+              <w:t xml:space="preserve">ensemble_final.py</w:t>
+            </w:r>
+          </w:p>
+        </w:tc>
+        <w:tc>
+          <w:tcPr/>
+          <w:p>
+            <w:pPr>
+              <w:pStyle w:val="Compact"/>
+              <w:jc w:val="left"/>
+            </w:pPr>
+            <w:r>
+              <w:t xml:space="preserve">四模型 TTA 加权集成, 生成提交</w:t>
+            </w:r>
+          </w:p>
+        </w:tc>
+        <w:tc>
+          <w:tcPr/>
+          <w:p>
+            <w:pPr>
+              <w:pStyle w:val="Compact"/>
+              <w:jc w:val="left"/>
+            </w:pPr>
+            <w:r>
+              <w:rPr>
+                <w:rStyle w:val="VerbatimChar"/>
+              </w:rPr>
+              <w:t xml:space="preserve">submission_final.csv</w:t>
+            </w:r>
+            <w:r>
+              <w:t xml:space="preserve"> </w:t>
+            </w:r>
+            <w:r>
+              <w:t xml:space="preserve">(val 86.40%)</w:t>
+            </w:r>
+          </w:p>
+        </w:tc>
+      </w:tr>
+    </w:tbl>
+    <w:p>
+      <w:pPr>
+        <w:pStyle w:val="BodyText"/>
+      </w:pPr>
+      <w:r>
+        <w:t xml:space="preserve">数据流:</w:t>
+      </w:r>
+    </w:p>
+    <w:p>
+      <w:pPr>
+        <w:pStyle w:val="SourceCode"/>
+      </w:pPr>
+      <w:r>
+        <w:rPr>
+          <w:rStyle w:val="VerbatimChar"/>
+        </w:rPr>
+        <w:t xml:space="preserve">train_resnet ─┐</w:t>
+      </w:r>
+      <w:r>
+        <w:br/>
+      </w:r>
+      <w:r>
+        <w:rPr>
+          <w:rStyle w:val="VerbatimChar"/>
+        </w:rPr>
+        <w:t xml:space="preserve">              ├→ generate_teacher_logits → 软标签</w:t>
+      </w:r>
+      <w:r>
+        <w:br/>
+      </w:r>
+      <w:r>
+        <w:rPr>
+          <w:rStyle w:val="VerbatimChar"/>
+        </w:rPr>
+        <w:t xml:space="preserve">train_blur  ──┘        │</w:t>
+      </w:r>
+      <w:r>
+        <w:br/>
+      </w:r>
+      <w:r>
+        <w:rPr>
+          <w:rStyle w:val="VerbatimChar"/>
+        </w:rPr>
+        <w:t xml:space="preserve">                       ▼</w:t>
+      </w:r>
+      <w:r>
+        <w:br/>
+      </w:r>
+      <w:r>
+        <w:rPr>
+          <w:rStyle w:val="VerbatimChar"/>
+        </w:rPr>
+        <w:t xml:space="preserve">              train_student(dist64) ──软标签──→ train_final(dist128)</w:t>
+      </w:r>
+      <w:r>
+        <w:br/>
+      </w:r>
+      <w:r>
+        <w:rPr>
+          <w:rStyle w:val="VerbatimChar"/>
+        </w:rPr>
+        <w:t xml:space="preserve">                                            ├→ train_adam</w:t>
+      </w:r>
+      <w:r>
+        <w:br/>
+      </w:r>
+      <w:r>
+        <w:rPr>
+          <w:rStyle w:val="VerbatimChar"/>
+        </w:rPr>
+        <w:t xml:space="preserve">                                            └→ train_mutual</w:t>
+      </w:r>
+      <w:r>
+        <w:br/>
+      </w:r>
+      <w:r>
+        <w:rPr>
+          <w:rStyle w:val="VerbatimChar"/>
+        </w:rPr>
+        <w:t xml:space="preserve">                       │</w:t>
+      </w:r>
+      <w:r>
+        <w:br/>
+      </w:r>
+      <w:r>
+        <w:rPr>
+          <w:rStyle w:val="VerbatimChar"/>
+        </w:rPr>
+        <w:t xml:space="preserve">                       ▼</w:t>
+      </w:r>
+      <w:r>
+        <w:br/>
+      </w:r>
+      <w:r>
+        <w:rPr>
+          <w:rStyle w:val="VerbatimChar"/>
+        </w:rPr>
+        <w:t xml:space="preserve">              ensemble_final → submission_final.csv</w:t>
+      </w:r>
+    </w:p>
+    <w:p>
+      <w:pPr>
+        <w:pStyle w:val="FirstParagraph"/>
+      </w:pPr>
+      <w:r>
+        <w:t xml:space="preserve">所有训练脚本共用同一套设置:数据增强(随机翻转、裁剪、颜色抖动、随机模糊)、按类别倒数加权的采样器(缓解类不平衡)、5 epoch 学习率热身 + 余弦退火,以及相同的 checkpoint 格式,可按</w:t>
+      </w:r>
+      <w:r>
+        <w:t xml:space="preserve"> </w:t>
+      </w:r>
+      <w:r>
+        <w:rPr>
+          <w:rStyle w:val="VerbatimChar"/>
+        </w:rPr>
+        <w:t xml:space="preserve">--resume</w:t>
+      </w:r>
+      <w:r>
+        <w:t xml:space="preserve"> </w:t>
+      </w:r>
+      <w:r>
+        <w:t xml:space="preserve">续训。</w:t>
+      </w:r>
+    </w:p>
+    <w:p>
+      <w:r>
+        <w:pict>
+          <v:rect style="width:0;height:1.5pt" o:hralign="center" o:hrstd="t" o:hr="t"/>
+        </w:pict>
+      </w:r>
+    </w:p>
+    <w:bookmarkEnd w:id="20"/>
+    <w:bookmarkStart w:id="21" w:name="二最终方案"/>
+    <w:p>
+      <w:pPr>
+        <w:pStyle w:val="Heading2"/>
+      </w:pPr>
+      <w:r>
+        <w:t xml:space="preserve">二、最终方案</w:t>
       </w:r>
     </w:p>
     <w:tbl>
@@ -377,14 +973,14 @@
         </w:pict>
       </w:r>
     </w:p>
-    <w:bookmarkEnd w:id="20"/>
-    <w:bookmarkStart w:id="21" w:name="二尝试过的方法与结果按时间顺序"/>
+    <w:bookmarkEnd w:id="21"/>
+    <w:bookmarkStart w:id="22" w:name="三尝试过的方法与结果按时间顺序"/>
     <w:p>
       <w:pPr>
         <w:pStyle w:val="Heading2"/>
       </w:pPr>
       <w:r>
-        <w:t xml:space="preserve">二、尝试过的方法与结果(按时间顺序)</w:t>
+        <w:t xml:space="preserve">三、尝试过的方法与结果(按时间顺序)</w:t>
       </w:r>
     </w:p>
     <w:tbl>
@@ -449,7 +1045,7 @@
               <w:jc w:val="left"/>
             </w:pPr>
             <w:r>
-              <w:t xml:space="preserve">有效?</w:t>
+              <w:t xml:space="preserve">是否有效</w:t>
             </w:r>
           </w:p>
         </w:tc>
@@ -573,7 +1169,7 @@
               <w:jc w:val="left"/>
             </w:pPr>
             <w:r>
-              <w:t xml:space="preserve">✅ 有效</w:t>
+              <w:t xml:space="preserve">有效</w:t>
             </w:r>
           </w:p>
         </w:tc>
@@ -635,19 +1231,19 @@
               <w:jc w:val="left"/>
             </w:pPr>
             <w:r>
-              <w:t xml:space="preserve">⚠️ 部分有效</w:t>
-            </w:r>
-          </w:p>
-        </w:tc>
-        <w:tc>
-          <w:tcPr/>
-          <w:p>
-            <w:pPr>
-              <w:pStyle w:val="Compact"/>
-              <w:jc w:val="left"/>
-            </w:pPr>
-            <w:r>
-              <w:t xml:space="preserve">单看 val 略降, 但在模糊图上 +60 点; test 真实模糊度不明确</w:t>
+              <w:t xml:space="preserve">部分有效</w:t>
+            </w:r>
+          </w:p>
+        </w:tc>
+        <w:tc>
+          <w:tcPr/>
+          <w:p>
+            <w:pPr>
+              <w:pStyle w:val="Compact"/>
+              <w:jc w:val="left"/>
+            </w:pPr>
+            <w:r>
+              <w:t xml:space="preserve">单看 val 略降, 但在模糊图上大幅提升; test 真实模糊度不明确</w:t>
             </w:r>
           </w:p>
         </w:tc>
@@ -673,7 +1269,7 @@
               <w:jc w:val="left"/>
             </w:pPr>
             <w:r>
-              <w:t xml:space="preserve">自蒸馏一阶段(教师=双模型集成软标签, 学生=11.7M 参数)</w:t>
+              <w:t xml:space="preserve">自蒸馏一阶段(教师=双模型集成软标签, 学生=加宽模型)</w:t>
             </w:r>
           </w:p>
         </w:tc>
@@ -697,19 +1293,19 @@
               <w:jc w:val="left"/>
             </w:pPr>
             <w:r>
-              <w:t xml:space="preserve">✅ 有效</w:t>
-            </w:r>
-          </w:p>
-        </w:tc>
-        <w:tc>
-          <w:tcPr/>
-          <w:p>
-            <w:pPr>
-              <w:pStyle w:val="Compact"/>
-              <w:jc w:val="left"/>
-            </w:pPr>
-            <w:r>
-              <w:t xml:space="preserve">软标签携带类间相似性信息</w:t>
+              <w:t xml:space="preserve">有效</w:t>
+            </w:r>
+          </w:p>
+        </w:tc>
+        <w:tc>
+          <w:tcPr/>
+          <w:p>
+            <w:pPr>
+              <w:pStyle w:val="Compact"/>
+              <w:jc w:val="left"/>
+            </w:pPr>
+            <w:r>
+              <w:t xml:space="preserve">软标签携带类间相似性信息, 单点最大提升</w:t>
             </w:r>
           </w:p>
         </w:tc>
@@ -759,7 +1355,7 @@
               <w:jc w:val="left"/>
             </w:pPr>
             <w:r>
-              <w:t xml:space="preserve">✅ 小幅有效</w:t>
+              <w:t xml:space="preserve">小幅有效</w:t>
             </w:r>
           </w:p>
         </w:tc>
@@ -821,7 +1417,7 @@
               <w:jc w:val="left"/>
             </w:pPr>
             <w:r>
-              <w:t xml:space="preserve">✅ 有效</w:t>
+              <w:t xml:space="preserve">有效</w:t>
             </w:r>
           </w:p>
         </w:tc>
@@ -883,7 +1479,7 @@
               <w:jc w:val="left"/>
             </w:pPr>
             <w:r>
-              <w:t xml:space="preserve">✅ 有效</w:t>
+              <w:t xml:space="preserve">有效</w:t>
             </w:r>
           </w:p>
         </w:tc>
@@ -945,7 +1541,7 @@
               <w:jc w:val="left"/>
             </w:pPr>
             <w:r>
-              <w:t xml:space="preserve">❌ 无效</w:t>
+              <w:t xml:space="preserve">无效</w:t>
             </w:r>
           </w:p>
         </w:tc>
@@ -1007,7 +1603,7 @@
               <w:jc w:val="left"/>
             </w:pPr>
             <w:r>
-              <w:t xml:space="preserve">⚠️ 单模型弱</w:t>
+              <w:t xml:space="preserve">部分有效</w:t>
             </w:r>
           </w:p>
         </w:tc>
@@ -1069,7 +1665,7 @@
               <w:jc w:val="left"/>
             </w:pPr>
             <w:r>
-              <w:t xml:space="preserve">✅ 微幅有效</w:t>
+              <w:t xml:space="preserve">微幅有效</w:t>
             </w:r>
           </w:p>
         </w:tc>
@@ -1131,7 +1727,7 @@
               <w:jc w:val="left"/>
             </w:pPr>
             <w:r>
-              <w:t xml:space="preserve">❌ 无增益</w:t>
+              <w:t xml:space="preserve">无效</w:t>
             </w:r>
           </w:p>
         </w:tc>
@@ -1193,7 +1789,7 @@
               <w:jc w:val="left"/>
             </w:pPr>
             <w:r>
-              <w:t xml:space="preserve">⚠️ 单模型弱于 SGD</w:t>
+              <w:t xml:space="preserve">部分有效</w:t>
             </w:r>
           </w:p>
         </w:tc>
@@ -1255,7 +1851,7 @@
               <w:jc w:val="left"/>
             </w:pPr>
             <w:r>
-              <w:t xml:space="preserve">✅ 有效</w:t>
+              <w:t xml:space="preserve">有效</w:t>
             </w:r>
           </w:p>
         </w:tc>
@@ -1317,7 +1913,7 @@
               <w:jc w:val="left"/>
             </w:pPr>
             <w:r>
-              <w:t xml:space="preserve">⚠️ 介于两教师之间</w:t>
+              <w:t xml:space="preserve">部分有效</w:t>
             </w:r>
           </w:p>
         </w:tc>
@@ -1383,12 +1979,6 @@
               <w:jc w:val="left"/>
             </w:pPr>
             <w:r>
-              <w:t xml:space="preserve">✅</w:t>
-            </w:r>
-            <w:r>
-              <w:t xml:space="preserve"> </w:t>
-            </w:r>
-            <w:r>
               <w:rPr>
                 <w:bCs/>
                 <w:b/>
@@ -1455,7 +2045,7 @@
               <w:jc w:val="left"/>
             </w:pPr>
             <w:r>
-              <w:t xml:space="preserve">❌ 无效</w:t>
+              <w:t xml:space="preserve">无效</w:t>
             </w:r>
           </w:p>
         </w:tc>
@@ -1517,7 +2107,7 @@
               <w:jc w:val="left"/>
             </w:pPr>
             <w:r>
-              <w:t xml:space="preserve">❌ 未超基线</w:t>
+              <w:t xml:space="preserve">无效</w:t>
             </w:r>
           </w:p>
         </w:tc>
@@ -1579,7 +2169,7 @@
               <w:jc w:val="left"/>
             </w:pPr>
             <w:r>
-              <w:t xml:space="preserve">❌ 无效</w:t>
+              <w:t xml:space="preserve">无效</w:t>
             </w:r>
           </w:p>
         </w:tc>
@@ -1604,23 +2194,23 @@
         </w:pict>
       </w:r>
     </w:p>
-    <w:bookmarkEnd w:id="21"/>
-    <w:bookmarkStart w:id="29" w:name="三遇到的问题与解决"/>
+    <w:bookmarkEnd w:id="22"/>
+    <w:bookmarkStart w:id="28" w:name="四遇到的问题与解决"/>
     <w:p>
       <w:pPr>
         <w:pStyle w:val="Heading2"/>
       </w:pPr>
       <w:r>
-        <w:t xml:space="preserve">三、遇到的问题与解决</w:t>
-      </w:r>
-    </w:p>
-    <w:bookmarkStart w:id="22" w:name="nvml-驱动崩溃最大环境障碍"/>
+        <w:t xml:space="preserve">四、遇到的问题与解决</w:t>
+      </w:r>
+    </w:p>
+    <w:bookmarkStart w:id="23" w:name="续训学习率重启无效"/>
     <w:p>
       <w:pPr>
         <w:pStyle w:val="Heading3"/>
       </w:pPr>
       <w:r>
-        <w:t xml:space="preserve">1. NVML 驱动崩溃(最大环境障碍)</w:t>
+        <w:t xml:space="preserve">1. 续训(学习率重启)无效</w:t>
       </w:r>
     </w:p>
     <w:p>
@@ -1639,19 +2229,7 @@
         <w:t xml:space="preserve">现象</w:t>
       </w:r>
       <w:r>
-        <w:t xml:space="preserve">:训练在 batch≥84 时崩溃, 报</w:t>
-      </w:r>
-      <w:r>
-        <w:t xml:space="preserve"> </w:t>
-      </w:r>
-      <w:r>
-        <w:rPr>
-          <w:rStyle w:val="VerbatimChar"/>
-        </w:rPr>
-        <w:t xml:space="preserve">NVML_SUCCESS == DriverAPI::get()-&gt;nvmlInit_v2_() INTERNAL ASSERT FAILED at CUDACachingAllocator.cpp:1090</w:t>
-      </w:r>
-      <w:r>
-        <w:t xml:space="preserve">。</w:t>
+        <w:t xml:space="preserve">:resume + 余弦退火从 0.05 重启后, val 掉到 60% 以下且回不去。</w:t>
       </w:r>
     </w:p>
     <w:p>
@@ -1667,22 +2245,10 @@
           <w:bCs/>
           <w:b/>
         </w:rPr>
-        <w:t xml:space="preserve">排查过程</w:t>
-      </w:r>
-      <w:r>
-        <w:t xml:space="preserve">:逐步二分 batch(256→128→96→84→80), 定位到崩溃阈值在单次分配约 1.8GB; 反汇编 libc10_cuda.so 确认崩溃点在</w:t>
-      </w:r>
-      <w:r>
-        <w:t xml:space="preserve"> </w:t>
-      </w:r>
-      <w:r>
-        <w:rPr>
-          <w:rStyle w:val="VerbatimChar"/>
-        </w:rPr>
-        <w:t xml:space="preserve">get_fabric_access</w:t>
-      </w:r>
-      <w:r>
-        <w:t xml:space="preserve">(CUDA Fabric 检测), 而非真正显存不足。</w:t>
+        <w:t xml:space="preserve">原因</w:t>
+      </w:r>
+      <w:r>
+        <w:t xml:space="preserve">:已收敛模型被大学习率踢出最优谷底, 20 epoch 不足以爬回。</w:t>
       </w:r>
     </w:p>
     <w:p>
@@ -1698,66 +2264,20 @@
           <w:bCs/>
           <w:b/>
         </w:rPr>
-        <w:t xml:space="preserve">根因</w:t>
-      </w:r>
-      <w:r>
-        <w:t xml:space="preserve">:服务器 NVIDIA 内核模块(595.84)与用户空间库(595.99)版本错配, NVML 初始化返回错误码 18(DRIVER_NOT_LOADED), PyTorch 无优雅降级直接 assert。</w:t>
-      </w:r>
-    </w:p>
-    <w:p>
-      <w:pPr>
-        <w:numPr>
-          <w:ilvl w:val="0"/>
-          <w:numId w:val="1001"/>
-        </w:numPr>
-        <w:pStyle w:val="Compact"/>
-      </w:pPr>
-      <w:r>
-        <w:rPr>
-          <w:bCs/>
-          <w:b/>
-        </w:rPr>
         <w:t xml:space="preserve">解决</w:t>
       </w:r>
       <w:r>
-        <w:t xml:space="preserve">:①</w:t>
-      </w:r>
-      <w:r>
-        <w:t xml:space="preserve"> </w:t>
-      </w:r>
-      <w:r>
-        <w:rPr>
-          <w:rStyle w:val="VerbatimChar"/>
-        </w:rPr>
-        <w:t xml:space="preserve">CUDA_VISIBLE_DEVICES=0</w:t>
-      </w:r>
-      <w:r>
-        <w:t xml:space="preserve"> </w:t>
-      </w:r>
-      <w:r>
-        <w:t xml:space="preserve">单卡限制(避免 P2P/Fabric 检测); ②</w:t>
-      </w:r>
-      <w:r>
-        <w:t xml:space="preserve"> </w:t>
-      </w:r>
-      <w:r>
-        <w:rPr>
-          <w:rStyle w:val="VerbatimChar"/>
-        </w:rPr>
-        <w:t xml:space="preserve">PYTORCH_NVML_BASED_CUDA_CALL=0</w:t>
-      </w:r>
-      <w:r>
-        <w:t xml:space="preserve">; ③ batch 控制在显存峰值 2GB 以内(64px 用 64, 128px 用 16+梯度累积)。彻底修复需 sudo 重启驱动, 未执行。</w:t>
-      </w:r>
-    </w:p>
-    <w:bookmarkEnd w:id="22"/>
-    <w:bookmarkStart w:id="23" w:name="续训学习率重启无效"/>
+        <w:t xml:space="preserve">:对已收敛模型, 从低学习率(lr=1e-4~1e-3)继续, 而非完整重启调度。</w:t>
+      </w:r>
+    </w:p>
+    <w:bookmarkEnd w:id="23"/>
+    <w:bookmarkStart w:id="24" w:name="arcface-不收敛"/>
     <w:p>
       <w:pPr>
         <w:pStyle w:val="Heading3"/>
       </w:pPr>
       <w:r>
-        <w:t xml:space="preserve">2. 续训(学习率重启)无效</w:t>
+        <w:t xml:space="preserve">2. ArcFace 不收敛</w:t>
       </w:r>
     </w:p>
     <w:p>
@@ -1776,7 +2296,7 @@
         <w:t xml:space="preserve">现象</w:t>
       </w:r>
       <w:r>
-        <w:t xml:space="preserve">:resume + 余弦退火从 0.05 重启后, val 掉到 60% 以下且回不去。</w:t>
+        <w:t xml:space="preserve">:纯 ArcFace(m=0.5, s=64)从零训练, loss 从 42 涨到 54, 准确率卡在 0.1%。</w:t>
       </w:r>
     </w:p>
     <w:p>
@@ -1792,10 +2312,10 @@
           <w:bCs/>
           <w:b/>
         </w:rPr>
-        <w:t xml:space="preserve">原因</w:t>
-      </w:r>
-      <w:r>
-        <w:t xml:space="preserve">:已收敛模型被大学习率踢出最优谷底, 20 epoch 不足以爬回。</w:t>
+        <w:t xml:space="preserve">排查</w:t>
+      </w:r>
+      <w:r>
+        <w:t xml:space="preserve">:检查梯度方向(正确), 定位到 margin 过大导致初始时正确类被压得过狠。</w:t>
       </w:r>
     </w:p>
     <w:p>
@@ -1811,20 +2331,39 @@
           <w:bCs/>
           <w:b/>
         </w:rPr>
+        <w:t xml:space="preserve">尝试</w:t>
+      </w:r>
+      <w:r>
+        <w:t xml:space="preserve">:动态 margin 预热、m=0.3/0.2、预训练骨干初始化 + 低学习率微调。最佳 78.2%, 仍未超过 CE+蒸馏基线。</w:t>
+      </w:r>
+    </w:p>
+    <w:p>
+      <w:pPr>
+        <w:numPr>
+          <w:ilvl w:val="0"/>
+          <w:numId w:val="1002"/>
+        </w:numPr>
+        <w:pStyle w:val="Compact"/>
+      </w:pPr>
+      <w:r>
+        <w:rPr>
+          <w:bCs/>
+          <w:b/>
+        </w:rPr>
         <w:t xml:space="preserve">结论</w:t>
       </w:r>
       <w:r>
-        <w:t xml:space="preserve">:对已收敛模型, 正确做法是从低学习率(lr=1e-4~1e-3)继续, 而非完整重启调度。</w:t>
-      </w:r>
-    </w:p>
-    <w:bookmarkEnd w:id="23"/>
-    <w:bookmarkStart w:id="24" w:name="arcface-不收敛"/>
+        <w:t xml:space="preserve">:ArcFace 是为百万级数据设计的, 1000 类 ×93 张/类的小数据上不适用。</w:t>
+      </w:r>
+    </w:p>
+    <w:bookmarkEnd w:id="24"/>
+    <w:bookmarkStart w:id="25" w:name="蒸馏训练效率"/>
     <w:p>
       <w:pPr>
         <w:pStyle w:val="Heading3"/>
       </w:pPr>
       <w:r>
-        <w:t xml:space="preserve">3. ArcFace 不收敛</w:t>
+        <w:t xml:space="preserve">3. 蒸馏训练效率</w:t>
       </w:r>
     </w:p>
     <w:p>
@@ -1843,7 +2382,7 @@
         <w:t xml:space="preserve">现象</w:t>
       </w:r>
       <w:r>
-        <w:t xml:space="preserve">:纯 ArcFace(m=0.5, s=64)从零训练, loss 从 42 涨到 54, 准确率卡在 0.1%。</w:t>
+        <w:t xml:space="preserve">:128px 训练时每个 batch 在线跑 teacher 前向, 单 epoch 4 分钟, 100 epoch 需 7 小时。</w:t>
       </w:r>
     </w:p>
     <w:p>
@@ -1859,58 +2398,20 @@
           <w:bCs/>
           <w:b/>
         </w:rPr>
-        <w:t xml:space="preserve">排查</w:t>
-      </w:r>
-      <w:r>
-        <w:t xml:space="preserve">:检查梯度方向(正确), 定位到 margin 过大导致初始时正确类被压得过狠。</w:t>
-      </w:r>
-    </w:p>
-    <w:p>
-      <w:pPr>
-        <w:numPr>
-          <w:ilvl w:val="0"/>
-          <w:numId w:val="1003"/>
-        </w:numPr>
-        <w:pStyle w:val="Compact"/>
-      </w:pPr>
-      <w:r>
-        <w:rPr>
-          <w:bCs/>
-          <w:b/>
-        </w:rPr>
-        <w:t xml:space="preserve">尝试</w:t>
-      </w:r>
-      <w:r>
-        <w:t xml:space="preserve">:动态 margin 预热、m=0.3/0.2、预训练骨干初始化 + 低学习率微调。最佳结果 78.2%, 仍未超过 CE+蒸馏基线。</w:t>
-      </w:r>
-    </w:p>
-    <w:p>
-      <w:pPr>
-        <w:numPr>
-          <w:ilvl w:val="0"/>
-          <w:numId w:val="1003"/>
-        </w:numPr>
-        <w:pStyle w:val="Compact"/>
-      </w:pPr>
-      <w:r>
-        <w:rPr>
-          <w:bCs/>
-          <w:b/>
-        </w:rPr>
-        <w:t xml:space="preserve">结论</w:t>
-      </w:r>
-      <w:r>
-        <w:t xml:space="preserve">:ArcFace 是为百万级数据设计的, 1000 类 ×93 张/类的小数据上不适用。</w:t>
-      </w:r>
-    </w:p>
-    <w:bookmarkEnd w:id="24"/>
-    <w:bookmarkStart w:id="25" w:name="蒸馏训练效率"/>
+        <w:t xml:space="preserve">解决</w:t>
+      </w:r>
+      <w:r>
+        <w:t xml:space="preserve">:teacher 软标签一次性预生成存盘(fp16, 186MB), 训练时查表, 提速 4 倍。</w:t>
+      </w:r>
+    </w:p>
+    <w:bookmarkEnd w:id="25"/>
+    <w:bookmarkStart w:id="26" w:name="显存限制"/>
     <w:p>
       <w:pPr>
         <w:pStyle w:val="Heading3"/>
       </w:pPr>
       <w:r>
-        <w:t xml:space="preserve">4. 蒸馏训练效率</w:t>
+        <w:t xml:space="preserve">4. 显存限制</w:t>
       </w:r>
     </w:p>
     <w:p>
@@ -1929,7 +2430,7 @@
         <w:t xml:space="preserve">现象</w:t>
       </w:r>
       <w:r>
-        <w:t xml:space="preserve">:128px 训练时每个 batch 在线跑 teacher 前向, 单 epoch 4 分钟, 100 epoch 需 7 小时。</w:t>
+        <w:t xml:space="preserve">:训练期间 GPU 可用显存有限。</w:t>
       </w:r>
     </w:p>
     <w:p>
@@ -1948,17 +2449,17 @@
         <w:t xml:space="preserve">解决</w:t>
       </w:r>
       <w:r>
-        <w:t xml:space="preserve">:teacher 软标签一次性预生成存盘(fp16, 186MB), 训练时查表, 提速 4 倍。</w:t>
-      </w:r>
-    </w:p>
-    <w:bookmarkEnd w:id="25"/>
-    <w:bookmarkStart w:id="26" w:name="显存限制"/>
+        <w:t xml:space="preserve">:64px 使用 batch=64; 128px 使用 batch=16 + 梯度累积 4 步(等效 batch=64)。</w:t>
+      </w:r>
+    </w:p>
+    <w:bookmarkEnd w:id="26"/>
+    <w:bookmarkStart w:id="27" w:name="小-bug-记录"/>
     <w:p>
       <w:pPr>
         <w:pStyle w:val="Heading3"/>
       </w:pPr>
       <w:r>
-        <w:t xml:space="preserve">5. 显存限制</w:t>
+        <w:t xml:space="preserve">5. 小 bug 记录</w:t>
       </w:r>
     </w:p>
     <w:p>
@@ -1970,14 +2471,34 @@
         <w:pStyle w:val="Compact"/>
       </w:pPr>
       <w:r>
-        <w:rPr>
-          <w:bCs/>
-          <w:b/>
-        </w:rPr>
-        <w:t xml:space="preserve">现象</w:t>
-      </w:r>
-      <w:r>
-        <w:t xml:space="preserve">:训练期间其他用户占用了 GPU, 单卡实际可用仅 2.0~2.6GB。</w:t>
+        <w:t xml:space="preserve">DataLoader 返回三元组(带索引)后</w:t>
+      </w:r>
+      <w:r>
+        <w:t xml:space="preserve"> </w:t>
+      </w:r>
+      <w:r>
+        <w:rPr>
+          <w:rStyle w:val="VerbatimChar"/>
+        </w:rPr>
+        <w:t xml:space="preserve">evaluate</w:t>
+      </w:r>
+      <w:r>
+        <w:t xml:space="preserve"> </w:t>
+      </w:r>
+      <w:r>
+        <w:t xml:space="preserve">解包失败 → 改为</w:t>
+      </w:r>
+      <w:r>
+        <w:t xml:space="preserve"> </w:t>
+      </w:r>
+      <w:r>
+        <w:rPr>
+          <w:rStyle w:val="VerbatimChar"/>
+        </w:rPr>
+        <w:t xml:space="preserve">batch[0], batch[1]</w:t>
+      </w:r>
+      <w:r>
+        <w:t xml:space="preserve">。</w:t>
       </w:r>
     </w:p>
     <w:p>
@@ -1990,198 +2511,61 @@
       </w:pPr>
       <w:r>
         <w:rPr>
-          <w:bCs/>
-          <w:b/>
-        </w:rPr>
-        <w:t xml:space="preserve">解决</w:t>
-      </w:r>
-      <w:r>
-        <w:t xml:space="preserve">:64px batch=64; 128px batch=16 + 梯度累积 4 步(等效 batch=64)。</w:t>
-      </w:r>
-    </w:p>
-    <w:bookmarkEnd w:id="26"/>
-    <w:bookmarkStart w:id="27" w:name="github-推送失败"/>
-    <w:p>
-      <w:pPr>
-        <w:pStyle w:val="Heading3"/>
-      </w:pPr>
-      <w:r>
-        <w:t xml:space="preserve">6. GitHub 推送失败</w:t>
+          <w:rStyle w:val="VerbatimChar"/>
+        </w:rPr>
+        <w:t xml:space="preserve">torch.load</w:t>
+      </w:r>
+      <w:r>
+        <w:t xml:space="preserve"> </w:t>
+      </w:r>
+      <w:r>
+        <w:t xml:space="preserve">在 PyTorch 2.6+ 默认</w:t>
+      </w:r>
+      <w:r>
+        <w:t xml:space="preserve"> </w:t>
+      </w:r>
+      <w:r>
+        <w:rPr>
+          <w:rStyle w:val="VerbatimChar"/>
+        </w:rPr>
+        <w:t xml:space="preserve">weights_only=True</w:t>
+      </w:r>
+      <w:r>
+        <w:t xml:space="preserve"> </w:t>
+      </w:r>
+      <w:r>
+        <w:t xml:space="preserve">导致加载失败 → 显式</w:t>
+      </w:r>
+      <w:r>
+        <w:t xml:space="preserve"> </w:t>
+      </w:r>
+      <w:r>
+        <w:rPr>
+          <w:rStyle w:val="VerbatimChar"/>
+        </w:rPr>
+        <w:t xml:space="preserve">weights_only=False</w:t>
+      </w:r>
+      <w:r>
+        <w:t xml:space="preserve">。</w:t>
       </w:r>
     </w:p>
     <w:p>
       <w:pPr>
         <w:numPr>
           <w:ilvl w:val="0"/>
-          <w:numId w:val="1006"/>
+          <w:numId w:val="1005"/>
         </w:numPr>
         <w:pStyle w:val="Compact"/>
       </w:pPr>
       <w:r>
-        <w:rPr>
-          <w:bCs/>
-          <w:b/>
-        </w:rPr>
-        <w:t xml:space="preserve">现象</w:t>
-      </w:r>
-      <w:r>
-        <w:t xml:space="preserve">:代理(127.0.0.1:7890)SSL 隧道坏掉, push 报</w:t>
-      </w:r>
-      <w:r>
-        <w:t xml:space="preserve"> </w:t>
-      </w:r>
-      <w:r>
-        <w:rPr>
-          <w:rStyle w:val="VerbatimChar"/>
-        </w:rPr>
-        <w:t xml:space="preserve">gnutls_handshake() failed</w:t>
-      </w:r>
-      <w:r>
-        <w:t xml:space="preserve">。</w:t>
+        <w:t xml:space="preserve">sed 修改优化器参数时误删括号导致语法错误 → 手动修正。</w:t>
       </w:r>
     </w:p>
     <w:p>
       <w:pPr>
         <w:numPr>
           <w:ilvl w:val="0"/>
-          <w:numId w:val="1006"/>
-        </w:numPr>
-        <w:pStyle w:val="Compact"/>
-      </w:pPr>
-      <w:r>
-        <w:rPr>
-          <w:bCs/>
-          <w:b/>
-        </w:rPr>
-        <w:t xml:space="preserve">解决</w:t>
-      </w:r>
-      <w:r>
-        <w:t xml:space="preserve">:绕过代理直连(</w:t>
-      </w:r>
-      <w:r>
-        <w:rPr>
-          <w:rStyle w:val="VerbatimChar"/>
-        </w:rPr>
-        <w:t xml:space="preserve">env -u http_proxy -u https_proxy git push</w:t>
-      </w:r>
-      <w:r>
-        <w:t xml:space="preserve">)。</w:t>
-      </w:r>
-    </w:p>
-    <w:bookmarkEnd w:id="27"/>
-    <w:bookmarkStart w:id="28" w:name="小-bug-记录"/>
-    <w:p>
-      <w:pPr>
-        <w:pStyle w:val="Heading3"/>
-      </w:pPr>
-      <w:r>
-        <w:t xml:space="preserve">7. 小 bug 记录</w:t>
-      </w:r>
-    </w:p>
-    <w:p>
-      <w:pPr>
-        <w:numPr>
-          <w:ilvl w:val="0"/>
-          <w:numId w:val="1007"/>
-        </w:numPr>
-        <w:pStyle w:val="Compact"/>
-      </w:pPr>
-      <w:r>
-        <w:t xml:space="preserve">DataLoader 返回三元组(带索引)后</w:t>
-      </w:r>
-      <w:r>
-        <w:t xml:space="preserve"> </w:t>
-      </w:r>
-      <w:r>
-        <w:rPr>
-          <w:rStyle w:val="VerbatimChar"/>
-        </w:rPr>
-        <w:t xml:space="preserve">evaluate</w:t>
-      </w:r>
-      <w:r>
-        <w:t xml:space="preserve"> </w:t>
-      </w:r>
-      <w:r>
-        <w:t xml:space="preserve">解包失败 → 改为</w:t>
-      </w:r>
-      <w:r>
-        <w:t xml:space="preserve"> </w:t>
-      </w:r>
-      <w:r>
-        <w:rPr>
-          <w:rStyle w:val="VerbatimChar"/>
-        </w:rPr>
-        <w:t xml:space="preserve">batch[0], batch[1]</w:t>
-      </w:r>
-      <w:r>
-        <w:t xml:space="preserve">。</w:t>
-      </w:r>
-    </w:p>
-    <w:p>
-      <w:pPr>
-        <w:numPr>
-          <w:ilvl w:val="0"/>
-          <w:numId w:val="1007"/>
-        </w:numPr>
-        <w:pStyle w:val="Compact"/>
-      </w:pPr>
-      <w:r>
-        <w:rPr>
-          <w:rStyle w:val="VerbatimChar"/>
-        </w:rPr>
-        <w:t xml:space="preserve">torch.load</w:t>
-      </w:r>
-      <w:r>
-        <w:t xml:space="preserve"> </w:t>
-      </w:r>
-      <w:r>
-        <w:t xml:space="preserve">在 PyTorch 2.6+ 默认</w:t>
-      </w:r>
-      <w:r>
-        <w:t xml:space="preserve"> </w:t>
-      </w:r>
-      <w:r>
-        <w:rPr>
-          <w:rStyle w:val="VerbatimChar"/>
-        </w:rPr>
-        <w:t xml:space="preserve">weights_only=True</w:t>
-      </w:r>
-      <w:r>
-        <w:t xml:space="preserve"> </w:t>
-      </w:r>
-      <w:r>
-        <w:t xml:space="preserve">导致加载失败 → 显式</w:t>
-      </w:r>
-      <w:r>
-        <w:t xml:space="preserve"> </w:t>
-      </w:r>
-      <w:r>
-        <w:rPr>
-          <w:rStyle w:val="VerbatimChar"/>
-        </w:rPr>
-        <w:t xml:space="preserve">weights_only=False</w:t>
-      </w:r>
-      <w:r>
-        <w:t xml:space="preserve">。</w:t>
-      </w:r>
-    </w:p>
-    <w:p>
-      <w:pPr>
-        <w:numPr>
-          <w:ilvl w:val="0"/>
-          <w:numId w:val="1007"/>
-        </w:numPr>
-        <w:pStyle w:val="Compact"/>
-      </w:pPr>
-      <w:r>
-        <w:t xml:space="preserve">sed 修改优化器参数时误删括号导致语法错误 → 手动修正。</w:t>
-      </w:r>
-    </w:p>
-    <w:p>
-      <w:pPr>
-        <w:numPr>
-          <w:ilvl w:val="0"/>
-          <w:numId w:val="1007"/>
+          <w:numId w:val="1005"/>
         </w:numPr>
         <w:pStyle w:val="Compact"/>
       </w:pPr>
@@ -2196,15 +2580,15 @@
         </w:pict>
       </w:r>
     </w:p>
+    <w:bookmarkEnd w:id="27"/>
     <w:bookmarkEnd w:id="28"/>
-    <w:bookmarkEnd w:id="29"/>
-    <w:bookmarkStart w:id="30" w:name="四哪些方法有效无效总结论"/>
+    <w:bookmarkStart w:id="29" w:name="五哪些方法有效无效总结论"/>
     <w:p>
       <w:pPr>
         <w:pStyle w:val="Heading2"/>
       </w:pPr>
       <w:r>
-        <w:t xml:space="preserve">四、哪些方法有效/无效(总结论)</w:t>
+        <w:t xml:space="preserve">五、哪些方法有效/无效(总结论)</w:t>
       </w:r>
     </w:p>
     <w:p>
@@ -2365,14 +2749,14 @@
         </w:pict>
       </w:r>
     </w:p>
-    <w:bookmarkEnd w:id="30"/>
-    <w:bookmarkStart w:id="31" w:name="五复现所需文件"/>
+    <w:bookmarkEnd w:id="29"/>
+    <w:bookmarkStart w:id="30" w:name="六复现所需文件"/>
     <w:p>
       <w:pPr>
         <w:pStyle w:val="Heading2"/>
       </w:pPr>
       <w:r>
-        <w:t xml:space="preserve">五、复现所需文件</w:t>
+        <w:t xml:space="preserve">六、复现所需文件</w:t>
       </w:r>
     </w:p>
     <w:tbl>
@@ -2427,19 +2811,19 @@
               <w:rPr>
                 <w:rStyle w:val="VerbatimChar"/>
               </w:rPr>
-              <w:t xml:space="preserve">ensemble_final.py</w:t>
-            </w:r>
-          </w:p>
-        </w:tc>
-        <w:tc>
-          <w:tcPr/>
-          <w:p>
-            <w:pPr>
-              <w:pStyle w:val="Compact"/>
-              <w:jc w:val="left"/>
-            </w:pPr>
-            <w:r>
-              <w:t xml:space="preserve">最终集成提交脚本(独立可运行)</w:t>
+              <w:t xml:space="preserve">train/train_resnet.py</w:t>
+            </w:r>
+          </w:p>
+        </w:tc>
+        <w:tc>
+          <w:tcPr/>
+          <w:p>
+            <w:pPr>
+              <w:pStyle w:val="Compact"/>
+              <w:jc w:val="left"/>
+            </w:pPr>
+            <w:r>
+              <w:t xml:space="preserve">教师 1(清晰版)训练</w:t>
             </w:r>
           </w:p>
         </w:tc>
@@ -2456,19 +2840,19 @@
               <w:rPr>
                 <w:rStyle w:val="VerbatimChar"/>
               </w:rPr>
-              <w:t xml:space="preserve">best_mutual.pth</w:t>
-            </w:r>
-          </w:p>
-        </w:tc>
-        <w:tc>
-          <w:tcPr/>
-          <w:p>
-            <w:pPr>
-              <w:pStyle w:val="Compact"/>
-              <w:jc w:val="left"/>
-            </w:pPr>
-            <w:r>
-              <w:t xml:space="preserve">相互蒸馏模型(10%)</w:t>
+              <w:t xml:space="preserve">train/train_blur.py</w:t>
+            </w:r>
+          </w:p>
+        </w:tc>
+        <w:tc>
+          <w:tcPr/>
+          <w:p>
+            <w:pPr>
+              <w:pStyle w:val="Compact"/>
+              <w:jc w:val="left"/>
+            </w:pPr>
+            <w:r>
+              <w:t xml:space="preserve">教师 2(模糊鲁棒版)训练</w:t>
             </w:r>
           </w:p>
         </w:tc>
@@ -2485,19 +2869,19 @@
               <w:rPr>
                 <w:rStyle w:val="VerbatimChar"/>
               </w:rPr>
-              <w:t xml:space="preserve">best_adam.pth</w:t>
-            </w:r>
-          </w:p>
-        </w:tc>
-        <w:tc>
-          <w:tcPr/>
-          <w:p>
-            <w:pPr>
-              <w:pStyle w:val="Compact"/>
-              <w:jc w:val="left"/>
-            </w:pPr>
-            <w:r>
-              <w:t xml:space="preserve">Adam 版(20%)</w:t>
+              <w:t xml:space="preserve">utility/generate_teacher_logits.py</w:t>
+            </w:r>
+          </w:p>
+        </w:tc>
+        <w:tc>
+          <w:tcPr/>
+          <w:p>
+            <w:pPr>
+              <w:pStyle w:val="Compact"/>
+              <w:jc w:val="left"/>
+            </w:pPr>
+            <w:r>
+              <w:t xml:space="preserve">教师软标签生成</w:t>
             </w:r>
           </w:p>
         </w:tc>
@@ -2514,19 +2898,19 @@
               <w:rPr>
                 <w:rStyle w:val="VerbatimChar"/>
               </w:rPr>
-              <w:t xml:space="preserve">best_student.pth</w:t>
-            </w:r>
-          </w:p>
-        </w:tc>
-        <w:tc>
-          <w:tcPr/>
-          <w:p>
-            <w:pPr>
-              <w:pStyle w:val="Compact"/>
-              <w:jc w:val="left"/>
-            </w:pPr>
-            <w:r>
-              <w:t xml:space="preserve">dist64(25%)</w:t>
+              <w:t xml:space="preserve">train/train_student.py</w:t>
+            </w:r>
+          </w:p>
+        </w:tc>
+        <w:tc>
+          <w:tcPr/>
+          <w:p>
+            <w:pPr>
+              <w:pStyle w:val="Compact"/>
+              <w:jc w:val="left"/>
+            </w:pPr>
+            <w:r>
+              <w:t xml:space="preserve">dist64 训练</w:t>
             </w:r>
           </w:p>
         </w:tc>
@@ -2543,19 +2927,106 @@
               <w:rPr>
                 <w:rStyle w:val="VerbatimChar"/>
               </w:rPr>
-              <w:t xml:space="preserve">best_final.pth</w:t>
-            </w:r>
-          </w:p>
-        </w:tc>
-        <w:tc>
-          <w:tcPr/>
-          <w:p>
-            <w:pPr>
-              <w:pStyle w:val="Compact"/>
-              <w:jc w:val="left"/>
-            </w:pPr>
-            <w:r>
-              <w:t xml:space="preserve">dist128(45%)</w:t>
+              <w:t xml:space="preserve">train/train_final.py</w:t>
+            </w:r>
+          </w:p>
+        </w:tc>
+        <w:tc>
+          <w:tcPr/>
+          <w:p>
+            <w:pPr>
+              <w:pStyle w:val="Compact"/>
+              <w:jc w:val="left"/>
+            </w:pPr>
+            <w:r>
+              <w:t xml:space="preserve">dist128 训练</w:t>
+            </w:r>
+          </w:p>
+        </w:tc>
+      </w:tr>
+      <w:tr>
+        <w:tc>
+          <w:tcPr/>
+          <w:p>
+            <w:pPr>
+              <w:pStyle w:val="Compact"/>
+              <w:jc w:val="left"/>
+            </w:pPr>
+            <w:r>
+              <w:rPr>
+                <w:rStyle w:val="VerbatimChar"/>
+              </w:rPr>
+              <w:t xml:space="preserve">train/train_adam.py</w:t>
+            </w:r>
+          </w:p>
+        </w:tc>
+        <w:tc>
+          <w:tcPr/>
+          <w:p>
+            <w:pPr>
+              <w:pStyle w:val="Compact"/>
+              <w:jc w:val="left"/>
+            </w:pPr>
+            <w:r>
+              <w:t xml:space="preserve">adam 成员训练</w:t>
+            </w:r>
+          </w:p>
+        </w:tc>
+      </w:tr>
+      <w:tr>
+        <w:tc>
+          <w:tcPr/>
+          <w:p>
+            <w:pPr>
+              <w:pStyle w:val="Compact"/>
+              <w:jc w:val="left"/>
+            </w:pPr>
+            <w:r>
+              <w:rPr>
+                <w:rStyle w:val="VerbatimChar"/>
+              </w:rPr>
+              <w:t xml:space="preserve">train/train_mutual.py</w:t>
+            </w:r>
+          </w:p>
+        </w:tc>
+        <w:tc>
+          <w:tcPr/>
+          <w:p>
+            <w:pPr>
+              <w:pStyle w:val="Compact"/>
+              <w:jc w:val="left"/>
+            </w:pPr>
+            <w:r>
+              <w:t xml:space="preserve">mutual 成员训练</w:t>
+            </w:r>
+          </w:p>
+        </w:tc>
+      </w:tr>
+      <w:tr>
+        <w:tc>
+          <w:tcPr/>
+          <w:p>
+            <w:pPr>
+              <w:pStyle w:val="Compact"/>
+              <w:jc w:val="left"/>
+            </w:pPr>
+            <w:r>
+              <w:rPr>
+                <w:rStyle w:val="VerbatimChar"/>
+              </w:rPr>
+              <w:t xml:space="preserve">ensemble_final.py</w:t>
+            </w:r>
+          </w:p>
+        </w:tc>
+        <w:tc>
+          <w:tcPr/>
+          <w:p>
+            <w:pPr>
+              <w:pStyle w:val="Compact"/>
+              <w:jc w:val="left"/>
+            </w:pPr>
+            <w:r>
+              <w:t xml:space="preserve">最终集成提交脚本(独立可运行)</w:t>
             </w:r>
           </w:p>
         </w:tc>
@@ -2566,7 +3037,90 @@
         <w:pStyle w:val="BodyText"/>
       </w:pPr>
       <w:r>
-        <w:t xml:space="preserve">运行:</w:t>
+        <w:t xml:space="preserve">所需权重(checkpoint):</w:t>
+      </w:r>
+      <w:r>
+        <w:rPr>
+          <w:rStyle w:val="VerbatimChar"/>
+        </w:rPr>
+        <w:t xml:space="preserve">best.pth</w:t>
+      </w:r>
+      <w:r>
+        <w:t xml:space="preserve">、</w:t>
+      </w:r>
+      <w:r>
+        <w:rPr>
+          <w:rStyle w:val="VerbatimChar"/>
+        </w:rPr>
+        <w:t xml:space="preserve">best_blur.pth</w:t>
+      </w:r>
+      <w:r>
+        <w:t xml:space="preserve">、</w:t>
+      </w:r>
+      <w:r>
+        <w:rPr>
+          <w:rStyle w:val="VerbatimChar"/>
+        </w:rPr>
+        <w:t xml:space="preserve">best_student.pth</w:t>
+      </w:r>
+      <w:r>
+        <w:t xml:space="preserve">、</w:t>
+      </w:r>
+      <w:r>
+        <w:rPr>
+          <w:rStyle w:val="VerbatimChar"/>
+        </w:rPr>
+        <w:t xml:space="preserve">best_final.pth</w:t>
+      </w:r>
+      <w:r>
+        <w:t xml:space="preserve">、</w:t>
+      </w:r>
+      <w:r>
+        <w:rPr>
+          <w:rStyle w:val="VerbatimChar"/>
+        </w:rPr>
+        <w:t xml:space="preserve">best_adam.pth</w:t>
+      </w:r>
+      <w:r>
+        <w:t xml:space="preserve">、</w:t>
+      </w:r>
+      <w:r>
+        <w:rPr>
+          <w:rStyle w:val="VerbatimChar"/>
+        </w:rPr>
+        <w:t xml:space="preserve">best_mutual.pth</w:t>
+      </w:r>
+      <w:r>
+        <w:t xml:space="preserve">,以及软标签</w:t>
+      </w:r>
+      <w:r>
+        <w:t xml:space="preserve"> </w:t>
+      </w:r>
+      <w:r>
+        <w:rPr>
+          <w:rStyle w:val="VerbatimChar"/>
+        </w:rPr>
+        <w:t xml:space="preserve">teacher_logits_fp16.pt</w:t>
+      </w:r>
+      <w:r>
+        <w:t xml:space="preserve">、</w:t>
+      </w:r>
+      <w:r>
+        <w:rPr>
+          <w:rStyle w:val="VerbatimChar"/>
+        </w:rPr>
+        <w:t xml:space="preserve">teacher_logits_student_fp16.pt</w:t>
+      </w:r>
+      <w:r>
+        <w:t xml:space="preserve">。权重文件体积超出 Git 平台限制, 可按 README 中的复现流程重新训练生成。</w:t>
+      </w:r>
+    </w:p>
+    <w:p>
+      <w:pPr>
+        <w:pStyle w:val="BodyText"/>
+      </w:pPr>
+      <w:r>
+        <w:t xml:space="preserve">最终提交运行:</w:t>
       </w:r>
       <w:r>
         <w:rPr>
@@ -2594,8 +3148,8 @@
         <w:t xml:space="preserve">报告生成时间:2026-10-21。所有数值来自训练日志与 val 集实测。</w:t>
       </w:r>
     </w:p>
+    <w:bookmarkEnd w:id="30"/>
     <w:bookmarkEnd w:id="31"/>
-    <w:bookmarkEnd w:id="32"/>
     <w:sectPr/>
   </w:body>
 </w:document>
@@ -2794,12 +3348,6 @@
     <w:abstractNumId w:val="991"/>
   </w:num>
   <w:num w:numId="1005">
-    <w:abstractNumId w:val="991"/>
-  </w:num>
-  <w:num w:numId="1006">
-    <w:abstractNumId w:val="991"/>
-  </w:num>
-  <w:num w:numId="1007">
     <w:abstractNumId w:val="991"/>
   </w:num>
 </w:numbering>

</xml_diff>